<commit_message>
Add behavior aggregation features with Bayesian smoothing
- New notebook: behavior_features.ipynb computes 7 user-level aggregates
  from behavior_log (total events, pv/buy/cart/fav counts, unique cates,
  smoothed buy rate)
- Anti-leakage cutoff aligned with train end (UTC 2017-05-12 00:00)
- Updated preprocessing_section.docx with new section 4.10 covering
  behavior-log aggregates and Bayesian smoothing methodology
- Final dataset now 33 cols (A) / 32 cols (B), 1.87 GB total
</commit_message>
<xml_diff>
--- a/preprocessing_section.docx
+++ b/preprocessing_section.docx
@@ -1914,7 +1914,7 @@
         <w:rPr>
           <w:sz w:val="22"/>
         </w:rPr>
-        <w:t>To simulate production deployment, we adopted a strictly time-based three-way split. Random splitting was deliberately avoided to prevent training-time leakage of future information:</w:t>
+        <w:t>To simulate production deployment, we adopted a strictly time-based three-way split. Random splitting was deliberately avoided to prevent training-time leakage of future information. All split boundaries are defined at UTC midnight, equivalent to 08:00 Beijing time.</w:t>
       </w:r>
     </w:p>
     <w:tbl>
@@ -2179,7 +2179,7 @@
         <w:pStyle w:val="Heading2"/>
       </w:pPr>
       <w:r>
-        <w:t>4.9 Aggregate Features (Leakage-Safe)</w:t>
+        <w:t>4.9 Impression-Level Aggregate Features (Leakage-Safe)</w:t>
       </w:r>
     </w:p>
     <w:p>
@@ -2187,7 +2187,7 @@
         <w:rPr>
           <w:sz w:val="22"/>
         </w:rPr>
-        <w:t>To strengthen baseline models (LR, LightGBM) that cannot natively learn ID-based interactions, we augmented the feature set with five aggregate statistics derived strictly from the training partition:</w:t>
+        <w:t>To strengthen baseline models (LR, LightGBM) that cannot natively learn ID-based interactions, we augmented the feature set with five aggregate statistics derived strictly from the training partition of raw_sample:</w:t>
       </w:r>
     </w:p>
     <w:tbl>
@@ -2388,7 +2388,7 @@
         <w:rPr>
           <w:sz w:val="22"/>
         </w:rPr>
-        <w:t>These statistics were computed on train only and joined to all three splits (train, val, test). Lookups for IDs unseen in train were filled with the global training CTR (5.19% for Version A, 5.18% for Version B) -- operationally treating unknown entities as average-case priors. Statistics were computed independently for Versions A and B to preserve experimental isolation. This procedure guarantees no test-set or validation-set labels enter the feature computation pipeline.</w:t>
+        <w:t>These statistics were computed on train only and joined to all three splits (train, val, test). Lookups for IDs unseen in train were filled with the global training CTR (5.19% for Version A, 5.18% for Version B). Statistics were computed independently for Versions A and B to preserve experimental isolation. This procedure guarantees no test-set or validation-set labels enter the feature computation pipeline.</w:t>
       </w:r>
     </w:p>
     <w:p>
@@ -2396,7 +2396,7 @@
         <w:pStyle w:val="Heading2"/>
       </w:pPr>
       <w:r>
-        <w:t>4.10 Behavior Sequence Construction (Deferred)</w:t>
+        <w:t>4.10 Behavior-Log Aggregate Features (with Bayesian Smoothing)</w:t>
       </w:r>
     </w:p>
     <w:p>
@@ -2404,7 +2404,293 @@
         <w:rPr>
           <w:sz w:val="22"/>
         </w:rPr>
-        <w:t>The behavior_log table is reserved for sequence construction in support of attention-based models such as DIN. For each impression event, the user's most recent K behavior events strictly preceding the impression timestamp will be extracted and appended as a sequence-typed column. This step is performed separately from the static feature pipeline due to its scale (approx 723M source rows) and its specificity to sequence-aware architectures. Static-feature baselines (LR, LightGBM, Wide &amp; Deep, DeepFM) do not require this step.</w:t>
+        <w:t>To provide all baseline models with summary signals of user activity patterns -- and to ensure a fair comparison with DIN, which consumes the full behavior sequence -- we extracted seven user-level features from the behavior_log table.</w:t>
+      </w:r>
+    </w:p>
+    <w:tbl>
+      <w:tblPr>
+        <w:tblStyle w:val="LightGrid-Accent1"/>
+        <w:tblW w:type="auto" w:w="0"/>
+        <w:tblLook w:firstColumn="1" w:firstRow="1" w:lastColumn="0" w:lastRow="0" w:noHBand="0" w:noVBand="1" w:val="04A0"/>
+      </w:tblPr>
+      <w:tblGrid>
+        <w:gridCol w:w="4320"/>
+        <w:gridCol w:w="4320"/>
+      </w:tblGrid>
+      <w:tr>
+        <w:tc>
+          <w:tcPr>
+            <w:tcW w:type="dxa" w:w="4320"/>
+          </w:tcPr>
+          <w:p>
+            <w:r/>
+            <w:r>
+              <w:rPr>
+                <w:b/>
+                <w:sz w:val="20"/>
+              </w:rPr>
+              <w:t>Feature</w:t>
+            </w:r>
+          </w:p>
+        </w:tc>
+        <w:tc>
+          <w:tcPr>
+            <w:tcW w:type="dxa" w:w="4320"/>
+          </w:tcPr>
+          <w:p>
+            <w:r/>
+            <w:r>
+              <w:rPr>
+                <w:b/>
+                <w:sz w:val="20"/>
+              </w:rPr>
+              <w:t>Definition</w:t>
+            </w:r>
+          </w:p>
+        </w:tc>
+      </w:tr>
+      <w:tr>
+        <w:tc>
+          <w:tcPr>
+            <w:tcW w:type="dxa" w:w="4320"/>
+          </w:tcPr>
+          <w:p>
+            <w:r/>
+            <w:r>
+              <w:rPr>
+                <w:sz w:val="20"/>
+              </w:rPr>
+              <w:t>user_total_events</w:t>
+            </w:r>
+          </w:p>
+        </w:tc>
+        <w:tc>
+          <w:tcPr>
+            <w:tcW w:type="dxa" w:w="4320"/>
+          </w:tcPr>
+          <w:p>
+            <w:r/>
+            <w:r>
+              <w:rPr>
+                <w:sz w:val="20"/>
+              </w:rPr>
+              <w:t>Total number of behavior events per user</w:t>
+            </w:r>
+          </w:p>
+        </w:tc>
+      </w:tr>
+      <w:tr>
+        <w:tc>
+          <w:tcPr>
+            <w:tcW w:type="dxa" w:w="4320"/>
+          </w:tcPr>
+          <w:p>
+            <w:r/>
+            <w:r>
+              <w:rPr>
+                <w:sz w:val="20"/>
+              </w:rPr>
+              <w:t>user_total_pv</w:t>
+            </w:r>
+          </w:p>
+        </w:tc>
+        <w:tc>
+          <w:tcPr>
+            <w:tcW w:type="dxa" w:w="4320"/>
+          </w:tcPr>
+          <w:p>
+            <w:r/>
+            <w:r>
+              <w:rPr>
+                <w:sz w:val="20"/>
+              </w:rPr>
+              <w:t>Page-view (browse) events per user</w:t>
+            </w:r>
+          </w:p>
+        </w:tc>
+      </w:tr>
+      <w:tr>
+        <w:tc>
+          <w:tcPr>
+            <w:tcW w:type="dxa" w:w="4320"/>
+          </w:tcPr>
+          <w:p>
+            <w:r/>
+            <w:r>
+              <w:rPr>
+                <w:sz w:val="20"/>
+              </w:rPr>
+              <w:t>user_total_buy</w:t>
+            </w:r>
+          </w:p>
+        </w:tc>
+        <w:tc>
+          <w:tcPr>
+            <w:tcW w:type="dxa" w:w="4320"/>
+          </w:tcPr>
+          <w:p>
+            <w:r/>
+            <w:r>
+              <w:rPr>
+                <w:sz w:val="20"/>
+              </w:rPr>
+              <w:t>Purchase events per user</w:t>
+            </w:r>
+          </w:p>
+        </w:tc>
+      </w:tr>
+      <w:tr>
+        <w:tc>
+          <w:tcPr>
+            <w:tcW w:type="dxa" w:w="4320"/>
+          </w:tcPr>
+          <w:p>
+            <w:r/>
+            <w:r>
+              <w:rPr>
+                <w:sz w:val="20"/>
+              </w:rPr>
+              <w:t>user_total_cart</w:t>
+            </w:r>
+          </w:p>
+        </w:tc>
+        <w:tc>
+          <w:tcPr>
+            <w:tcW w:type="dxa" w:w="4320"/>
+          </w:tcPr>
+          <w:p>
+            <w:r/>
+            <w:r>
+              <w:rPr>
+                <w:sz w:val="20"/>
+              </w:rPr>
+              <w:t>Add-to-cart events per user</w:t>
+            </w:r>
+          </w:p>
+        </w:tc>
+      </w:tr>
+      <w:tr>
+        <w:tc>
+          <w:tcPr>
+            <w:tcW w:type="dxa" w:w="4320"/>
+          </w:tcPr>
+          <w:p>
+            <w:r/>
+            <w:r>
+              <w:rPr>
+                <w:sz w:val="20"/>
+              </w:rPr>
+              <w:t>user_total_fav</w:t>
+            </w:r>
+          </w:p>
+        </w:tc>
+        <w:tc>
+          <w:tcPr>
+            <w:tcW w:type="dxa" w:w="4320"/>
+          </w:tcPr>
+          <w:p>
+            <w:r/>
+            <w:r>
+              <w:rPr>
+                <w:sz w:val="20"/>
+              </w:rPr>
+              <w:t>Favorite/wishlist events per user</w:t>
+            </w:r>
+          </w:p>
+        </w:tc>
+      </w:tr>
+      <w:tr>
+        <w:tc>
+          <w:tcPr>
+            <w:tcW w:type="dxa" w:w="4320"/>
+          </w:tcPr>
+          <w:p>
+            <w:r/>
+            <w:r>
+              <w:rPr>
+                <w:sz w:val="20"/>
+              </w:rPr>
+              <w:t>user_n_unique_cates</w:t>
+            </w:r>
+          </w:p>
+        </w:tc>
+        <w:tc>
+          <w:tcPr>
+            <w:tcW w:type="dxa" w:w="4320"/>
+          </w:tcPr>
+          <w:p>
+            <w:r/>
+            <w:r>
+              <w:rPr>
+                <w:sz w:val="20"/>
+              </w:rPr>
+              <w:t>Number of distinct categories the user interacted with</w:t>
+            </w:r>
+          </w:p>
+        </w:tc>
+      </w:tr>
+      <w:tr>
+        <w:tc>
+          <w:tcPr>
+            <w:tcW w:type="dxa" w:w="4320"/>
+          </w:tcPr>
+          <w:p>
+            <w:r/>
+            <w:r>
+              <w:rPr>
+                <w:sz w:val="20"/>
+              </w:rPr>
+              <w:t>user_buy_rate</w:t>
+            </w:r>
+          </w:p>
+        </w:tc>
+        <w:tc>
+          <w:tcPr>
+            <w:tcW w:type="dxa" w:w="4320"/>
+          </w:tcPr>
+          <w:p>
+            <w:r/>
+            <w:r>
+              <w:rPr>
+                <w:sz w:val="20"/>
+              </w:rPr>
+              <w:t>Smoothed purchase rate (see equation below)</w:t>
+            </w:r>
+          </w:p>
+        </w:tc>
+      </w:tr>
+    </w:tbl>
+    <w:p>
+      <w:r>
+        <w:rPr>
+          <w:sz w:val="22"/>
+        </w:rPr>
+        <w:t>All statistics were computed on behavior_log filtered to t &lt; UTC 2017-05-12 00:00 -- the same cutoff used to define the boundary between train and validation in section 4.8. This temporal alignment guarantees that user features at any val or test impression reflect only behaviors that occurred during the training period, eliminating any future-information leakage. Coverage was 1,132,067 out of 1,141,729 unique users (99.2%); cold-start users absent from behavior_log received zero counts and the global prior for the rate feature.</w:t>
+      </w:r>
+    </w:p>
+    <w:p>
+      <w:r>
+        <w:rPr>
+          <w:sz w:val="22"/>
+        </w:rPr>
+        <w:t>For user_buy_rate, we applied Bayesian smoothing to stabilize estimates for low-activity users:</w:t>
+      </w:r>
+    </w:p>
+    <w:p>
+      <w:r>
+        <w:rPr>
+          <w:rFonts w:ascii="Courier New" w:hAnsi="Courier New"/>
+          <w:sz w:val="20"/>
+        </w:rPr>
+        <w:t>user_buy_rate = (n_buy + alpha * global_buy_rate) / (n_events + alpha)</w:t>
+      </w:r>
+    </w:p>
+    <w:p>
+      <w:r>
+        <w:rPr>
+          <w:sz w:val="22"/>
+        </w:rPr>
+        <w:t>with alpha = 10 (a standard choice in CTR modeling) and global_buy_rate = 0.0127, the train-period overall ratio of buy events to total events. This formulation can be interpreted as adding alpha synthetic events with the global rate as a prior. Users with sparse history are pulled toward the global mean, eliminating spurious extreme values; users with dense history retain their empirical rate. For example, a user with 1 buy in 1 event yields a smoothed rate of 0.103 (rather than 1.0), while a user with 50 buys in 1,000 events retains an estimate of 0.0496.</w:t>
       </w:r>
     </w:p>
     <w:p>
@@ -2412,7 +2698,23 @@
         <w:pStyle w:val="Heading2"/>
       </w:pPr>
       <w:r>
-        <w:t>4.11 Final Dataset Statistics</w:t>
+        <w:t>4.11 Behavior Sequence Construction (Deferred)</w:t>
+      </w:r>
+    </w:p>
+    <w:p>
+      <w:r>
+        <w:rPr>
+          <w:sz w:val="22"/>
+        </w:rPr>
+        <w:t>The behavior_log table is reserved for sequence construction in support of attention-based models such as DIN. For each impression event, the user's most recent K behavior events strictly preceding the impression timestamp will be extracted and appended as a sequence-typed column. This step is performed separately from the static feature pipeline due to its scale (approx 723M source rows) and its specificity to sequence-aware architectures. Static-feature baselines (LR, LightGBM, Wide &amp; Deep, DeepFM) do not require this step but benefit from the user-level behavior aggregates introduced in section 4.10.</w:t>
+      </w:r>
+    </w:p>
+    <w:p>
+      <w:pPr>
+        <w:pStyle w:val="Heading2"/>
+      </w:pPr>
+      <w:r>
+        <w:t>4.12 Final Dataset Statistics</w:t>
       </w:r>
     </w:p>
     <w:p>
@@ -2536,7 +2838,7 @@
               <w:rPr>
                 <w:sz w:val="20"/>
               </w:rPr>
-              <w:t>26</w:t>
+              <w:t>33</w:t>
             </w:r>
           </w:p>
         </w:tc>
@@ -2550,7 +2852,7 @@
               <w:rPr>
                 <w:sz w:val="20"/>
               </w:rPr>
-              <w:t>458.1 MB</w:t>
+              <w:t>730.8 MB</w:t>
             </w:r>
           </w:p>
         </w:tc>
@@ -2594,7 +2896,7 @@
               <w:rPr>
                 <w:sz w:val="20"/>
               </w:rPr>
-              <w:t>26</w:t>
+              <w:t>33</w:t>
             </w:r>
           </w:p>
         </w:tc>
@@ -2608,7 +2910,7 @@
               <w:rPr>
                 <w:sz w:val="20"/>
               </w:rPr>
-              <w:t>80.3 MB</w:t>
+              <w:t>126.0 MB</w:t>
             </w:r>
           </w:p>
         </w:tc>
@@ -2652,7 +2954,7 @@
               <w:rPr>
                 <w:sz w:val="20"/>
               </w:rPr>
-              <w:t>26</w:t>
+              <w:t>33</w:t>
             </w:r>
           </w:p>
         </w:tc>
@@ -2666,7 +2968,7 @@
               <w:rPr>
                 <w:sz w:val="20"/>
               </w:rPr>
-              <w:t>68.1 MB</w:t>
+              <w:t>107.7 MB</w:t>
             </w:r>
           </w:p>
         </w:tc>
@@ -2710,7 +3012,7 @@
               <w:rPr>
                 <w:sz w:val="20"/>
               </w:rPr>
-              <w:t>25</w:t>
+              <w:t>32</w:t>
             </w:r>
           </w:p>
         </w:tc>
@@ -2724,7 +3026,7 @@
               <w:rPr>
                 <w:sz w:val="20"/>
               </w:rPr>
-              <w:t>429.9 MB</w:t>
+              <w:t>687.4 MB</w:t>
             </w:r>
           </w:p>
         </w:tc>
@@ -2768,7 +3070,7 @@
               <w:rPr>
                 <w:sz w:val="20"/>
               </w:rPr>
-              <w:t>25</w:t>
+              <w:t>32</w:t>
             </w:r>
           </w:p>
         </w:tc>
@@ -2782,7 +3084,7 @@
               <w:rPr>
                 <w:sz w:val="20"/>
               </w:rPr>
-              <w:t>75.5 MB</w:t>
+              <w:t>118.5 MB</w:t>
             </w:r>
           </w:p>
         </w:tc>
@@ -2826,7 +3128,7 @@
               <w:rPr>
                 <w:sz w:val="20"/>
               </w:rPr>
-              <w:t>25</w:t>
+              <w:t>32</w:t>
             </w:r>
           </w:p>
         </w:tc>
@@ -2840,7 +3142,7 @@
               <w:rPr>
                 <w:sz w:val="20"/>
               </w:rPr>
-              <w:t>63.8 MB</w:t>
+              <w:t>100.9 MB</w:t>
             </w:r>
           </w:p>
         </w:tc>
@@ -2898,7 +3200,7 @@
               <w:rPr>
                 <w:sz w:val="20"/>
               </w:rPr>
-              <w:t>1.15 GB</w:t>
+              <w:t>1.87 GB</w:t>
             </w:r>
           </w:p>
         </w:tc>
@@ -2909,7 +3211,7 @@
         <w:rPr>
           <w:sz w:val="22"/>
         </w:rPr>
-        <w:t>Each row constitutes a self-contained training example: a click label clk in {0, 1} accompanied by 25 (Version B) or 26 (Version A) feature columns spanning user demographics, ad metadata, temporal context, and aggregate behavioral statistics.</w:t>
+        <w:t>Each row constitutes a self-contained training example: a click label clk in {0, 1} accompanied by 32 (Version B) or 33 (Version A) feature columns spanning user demographics, ad metadata, temporal context, impression-level aggregates, and behavior-log aggregates.</w:t>
       </w:r>
     </w:p>
     <w:sectPr>

</xml_diff>

<commit_message>
Add user_cate_ctr cross-aggregate feature with smoothing
</commit_message>
<xml_diff>
--- a/preprocessing_section.docx
+++ b/preprocessing_section.docx
@@ -2187,7 +2187,7 @@
         <w:rPr>
           <w:sz w:val="22"/>
         </w:rPr>
-        <w:t>To strengthen baseline models (LR, LightGBM) that cannot natively learn ID-based interactions, we augmented the feature set with five aggregate statistics derived strictly from the training partition of raw_sample:</w:t>
+        <w:t>To strengthen baseline models (LR, LightGBM) that cannot natively learn ID-based interactions, we augmented the feature set with six aggregate statistics derived strictly from the training partition of raw_sample:</w:t>
       </w:r>
     </w:p>
     <w:tbl>
@@ -2382,6 +2382,36 @@
           </w:p>
         </w:tc>
       </w:tr>
+      <w:tr>
+        <w:tc>
+          <w:tcPr>
+            <w:tcW w:type="dxa" w:w="4320"/>
+          </w:tcPr>
+          <w:p>
+            <w:r/>
+            <w:r>
+              <w:rPr>
+                <w:sz w:val="20"/>
+              </w:rPr>
+              <w:t>user_cate_ctr</w:t>
+            </w:r>
+          </w:p>
+        </w:tc>
+        <w:tc>
+          <w:tcPr>
+            <w:tcW w:type="dxa" w:w="4320"/>
+          </w:tcPr>
+          <w:p>
+            <w:r/>
+            <w:r>
+              <w:rPr>
+                <w:sz w:val="20"/>
+              </w:rPr>
+              <w:t>User-by-category empirical click rate (in train), Bayesian-smoothed</w:t>
+            </w:r>
+          </w:p>
+        </w:tc>
+      </w:tr>
     </w:tbl>
     <w:p>
       <w:r>
@@ -2389,6 +2419,39 @@
           <w:sz w:val="22"/>
         </w:rPr>
         <w:t>These statistics were computed on train only and joined to all three splits (train, val, test). Lookups for IDs unseen in train were filled with the global training CTR (5.19% for Version A, 5.18% for Version B). Statistics were computed independently for Versions A and B to preserve experimental isolation. This procedure guarantees no test-set or validation-set labels enter the feature computation pipeline.</w:t>
+      </w:r>
+    </w:p>
+    <w:p>
+      <w:r>
+        <w:rPr>
+          <w:sz w:val="22"/>
+        </w:rPr>
+        <w:t>user_cate_ctr is a statistical cross-aggregate -- a per-user, per-category click rate -- computed at sparse (user, category) pairs that actually appear in train (5,487,344 pairs in Version A; 5,169,445 in Version B), avoiding a Cartesian explosion. This feature provides baseline models with a strong, ad-relevant interest signal that they cannot otherwise easily learn from raw IDs.</w:t>
+      </w:r>
+    </w:p>
+    <w:p>
+      <w:r>
+        <w:rPr>
+          <w:sz w:val="22"/>
+        </w:rPr>
+        <w:t>Because (user, category) pairs often have few impressions, the empirical rate is high-variance. We apply Bayesian smoothing identical in form to the buy-rate smoothing in section 4.10:</w:t>
+      </w:r>
+    </w:p>
+    <w:p>
+      <w:r>
+        <w:rPr>
+          <w:rFonts w:ascii="Courier New" w:hAnsi="Courier New"/>
+          <w:sz w:val="20"/>
+        </w:rPr>
+        <w:t>user_cate_ctr = (n_clk + alpha * global_ctr) / (n_imp + alpha)</w:t>
+      </w:r>
+    </w:p>
+    <w:p>
+      <w:r>
+        <w:rPr>
+          <w:sz w:val="22"/>
+        </w:rPr>
+        <w:t>with alpha = 10. This pulls high-variance pairs (e.g., 1 impression and 1 click) toward the global rate while preserving accurate estimates for high-volume pairs.</w:t>
       </w:r>
     </w:p>
     <w:p>
@@ -2838,7 +2901,7 @@
               <w:rPr>
                 <w:sz w:val="20"/>
               </w:rPr>
-              <w:t>33</w:t>
+              <w:t>34</w:t>
             </w:r>
           </w:p>
         </w:tc>
@@ -2852,7 +2915,7 @@
               <w:rPr>
                 <w:sz w:val="20"/>
               </w:rPr>
-              <w:t>730.8 MB</w:t>
+              <w:t>788.8 MB</w:t>
             </w:r>
           </w:p>
         </w:tc>
@@ -2896,7 +2959,7 @@
               <w:rPr>
                 <w:sz w:val="20"/>
               </w:rPr>
-              <w:t>33</w:t>
+              <w:t>34</w:t>
             </w:r>
           </w:p>
         </w:tc>
@@ -2910,7 +2973,7 @@
               <w:rPr>
                 <w:sz w:val="20"/>
               </w:rPr>
-              <w:t>126.0 MB</w:t>
+              <w:t>134.5 MB</w:t>
             </w:r>
           </w:p>
         </w:tc>
@@ -2954,7 +3017,7 @@
               <w:rPr>
                 <w:sz w:val="20"/>
               </w:rPr>
-              <w:t>33</w:t>
+              <w:t>34</w:t>
             </w:r>
           </w:p>
         </w:tc>
@@ -2968,7 +3031,7 @@
               <w:rPr>
                 <w:sz w:val="20"/>
               </w:rPr>
-              <w:t>107.7 MB</w:t>
+              <w:t>114.8 MB</w:t>
             </w:r>
           </w:p>
         </w:tc>
@@ -3012,7 +3075,7 @@
               <w:rPr>
                 <w:sz w:val="20"/>
               </w:rPr>
-              <w:t>32</w:t>
+              <w:t>33</w:t>
             </w:r>
           </w:p>
         </w:tc>
@@ -3026,7 +3089,7 @@
               <w:rPr>
                 <w:sz w:val="20"/>
               </w:rPr>
-              <w:t>687.4 MB</w:t>
+              <w:t>742.2 MB</w:t>
             </w:r>
           </w:p>
         </w:tc>
@@ -3070,7 +3133,7 @@
               <w:rPr>
                 <w:sz w:val="20"/>
               </w:rPr>
-              <w:t>32</w:t>
+              <w:t>33</w:t>
             </w:r>
           </w:p>
         </w:tc>
@@ -3084,7 +3147,7 @@
               <w:rPr>
                 <w:sz w:val="20"/>
               </w:rPr>
-              <w:t>118.5 MB</w:t>
+              <w:t>126.4 MB</w:t>
             </w:r>
           </w:p>
         </w:tc>
@@ -3128,7 +3191,7 @@
               <w:rPr>
                 <w:sz w:val="20"/>
               </w:rPr>
-              <w:t>32</w:t>
+              <w:t>33</w:t>
             </w:r>
           </w:p>
         </w:tc>
@@ -3142,7 +3205,7 @@
               <w:rPr>
                 <w:sz w:val="20"/>
               </w:rPr>
-              <w:t>100.9 MB</w:t>
+              <w:t>107.5 MB</w:t>
             </w:r>
           </w:p>
         </w:tc>
@@ -3200,7 +3263,7 @@
               <w:rPr>
                 <w:sz w:val="20"/>
               </w:rPr>
-              <w:t>1.87 GB</w:t>
+              <w:t>2.02 GB</w:t>
             </w:r>
           </w:p>
         </w:tc>
@@ -3211,7 +3274,7 @@
         <w:rPr>
           <w:sz w:val="22"/>
         </w:rPr>
-        <w:t>Each row constitutes a self-contained training example: a click label clk in {0, 1} accompanied by 32 (Version B) or 33 (Version A) feature columns spanning user demographics, ad metadata, temporal context, impression-level aggregates, and behavior-log aggregates.</w:t>
+        <w:t>Each row constitutes a self-contained training example: a click label clk in {0, 1} accompanied by 33 (Version B) or 34 (Version A) feature columns spanning user demographics, ad metadata, temporal context, impression-level aggregates, behavior-log aggregates, and a user-by-category cross-aggregate.</w:t>
       </w:r>
     </w:p>
     <w:sectPr>

</xml_diff>

<commit_message>
Step 10: build DIN behavior sequences (K=50, leakage-safe)
</commit_message>
<xml_diff>
--- a/preprocessing_section.docx
+++ b/preprocessing_section.docx
@@ -2761,7 +2761,7 @@
         <w:pStyle w:val="Heading2"/>
       </w:pPr>
       <w:r>
-        <w:t>4.11 Behavior Sequence Construction (Deferred)</w:t>
+        <w:t>4.11 Behavior Sequence Construction for Sequential Models</w:t>
       </w:r>
     </w:p>
     <w:p>
@@ -2769,7 +2769,389 @@
         <w:rPr>
           <w:sz w:val="22"/>
         </w:rPr>
-        <w:t>The behavior_log table is reserved for sequence construction in support of attention-based models such as DIN. For each impression event, the user's most recent K behavior events strictly preceding the impression timestamp will be extracted and appended as a sequence-typed column. This step is performed separately from the static feature pipeline due to its scale (approx 723M source rows) and its specificity to sequence-aware architectures. Static-feature baselines (LR, LightGBM, Wide &amp; Deep, DeepFM) do not require this step but benefit from the user-level behavior aggregates introduced in section 4.10.</w:t>
+        <w:t>Static features alone cannot express dynamic user interest. Two users with identical demographics may exhibit very different click propensities for a given ad depending on what they have recently engaged with. To enable attention-based architectures such as DIN to model this interest dynamically, we augment each impression with a fixed-length sequence of the user's most recent K = 50 interactions in behavior_log, restricted to events strictly preceding the impression's timestamp. This new column, behavior_seq, is the principal input that allows DIN to compute candidate-aware user-interest representations via attention over relevant historical events.</w:t>
+      </w:r>
+    </w:p>
+    <w:p>
+      <w:pPr>
+        <w:pStyle w:val="Heading3"/>
+      </w:pPr>
+      <w:r>
+        <w:t>4.11.1 Sequence Specification</w:t>
+      </w:r>
+    </w:p>
+    <w:p>
+      <w:r>
+        <w:rPr>
+          <w:sz w:val="22"/>
+        </w:rPr>
+        <w:t>For each impression (u, t), behavior_seq is a length-50 vector of category IDs ordered chronologically: the most recent qualifying behavior occupies position K-1 (the last index). The choice of K = 50 follows the original DIN paper [Zhou et al., 2018] and balances expressiveness against memory and compute overhead. Each element is an int16 category code drawn from the same encoding space as the impression's cate_id (see 4.7.3), so that an attention layer can directly compare the candidate ad's cate_id against historical interaction cates without any auxiliary lookup.</w:t>
+      </w:r>
+    </w:p>
+    <w:p>
+      <w:r>
+        <w:rPr>
+          <w:sz w:val="22"/>
+        </w:rPr>
+        <w:t>All four observed behavior types in behavior_log -- pv (page view), cart (add-to-cart), fav (favorite), and buy (purchase) -- are included undifferentiated in the sequence. Page views dominate the distribution (95.2% of total behaviors), and finer behavior-type modeling is left to extensions such as DIEN [Zhou et al., 2019], which explicitly models the evolution between event types via a GRU.</w:t>
+      </w:r>
+    </w:p>
+    <w:p>
+      <w:pPr>
+        <w:pStyle w:val="Heading3"/>
+      </w:pPr>
+      <w:r>
+        <w:t>4.11.2 Anti-Leakage Constraints</w:t>
+      </w:r>
+    </w:p>
+    <w:p>
+      <w:r>
+        <w:rPr>
+          <w:sz w:val="22"/>
+        </w:rPr>
+        <w:t>Two leakage risks were addressed:</w:t>
+      </w:r>
+    </w:p>
+    <w:p>
+      <w:pPr>
+        <w:pStyle w:val="ListBullet"/>
+      </w:pPr>
+      <w:r>
+        <w:rPr>
+          <w:sz w:val="22"/>
+        </w:rPr>
+        <w:t>Temporal leakage: For each impression at time t, only behaviors with strictly t' &lt; t qualify. This enforces causality at the finest granularity, including across within-day boundaries.</w:t>
+      </w:r>
+    </w:p>
+    <w:p>
+      <w:pPr>
+        <w:pStyle w:val="ListBullet"/>
+      </w:pPr>
+      <w:r>
+        <w:rPr>
+          <w:sz w:val="22"/>
+        </w:rPr>
+        <w:t>Cross-split leakage: behavior_log was filtered to the same time window used in the train/val/test definition (4.8); behaviors after UTC 2017-05-13 11:59:46 (the last impression in the dataset) were discarded, preventing any future-information contamination.</w:t>
+      </w:r>
+    </w:p>
+    <w:p>
+      <w:r>
+        <w:rPr>
+          <w:sz w:val="22"/>
+        </w:rPr>
+        <w:t>Coverage of behavior_log within the valid time window was 657,502,835 events, reducing to 629,320,634 after restricting to categories present in the encoded ad-feature mapping (a 4.3% drop accounting for cates that appear in behavior_log but never in any ad). 1,130,232 of 1,141,729 unique users in raw_sample (99.0%) have at least one qualifying behavior event in this window.</w:t>
+      </w:r>
+    </w:p>
+    <w:p>
+      <w:pPr>
+        <w:pStyle w:val="Heading3"/>
+      </w:pPr>
+      <w:r>
+        <w:t>4.11.3 Encoding Consistency</w:t>
+      </w:r>
+    </w:p>
+    <w:p>
+      <w:r>
+        <w:rPr>
+          <w:sz w:val="22"/>
+        </w:rPr>
+        <w:t>A subtle but critical issue: the cate column in behavior_log is in raw integer form (range [1, 12960]) and must be encoded into the same 0-indexed space [0, 6768] used for cate_id elsewhere in the dataset. Failure to align these spaces would yield meaningless attention scores between candidate ads and historical events.</w:t>
+      </w:r>
+    </w:p>
+    <w:p>
+      <w:r>
+        <w:rPr>
+          <w:sz w:val="22"/>
+        </w:rPr>
+        <w:t>We reconstructed the encoding by sorting unique cate values in the post-Step-2 ad_feature table and assigning consecutive integers, exactly reproducing the dense_rank operation applied in 4.7.3. behavior_log entries whose cate is not present in the ad_feature mapping are dropped, ensuring referential integrity between sequence elements and ad-side category embeddings during model training.</w:t>
+      </w:r>
+    </w:p>
+    <w:p>
+      <w:pPr>
+        <w:pStyle w:val="Heading3"/>
+      </w:pPr>
+      <w:r>
+        <w:t>4.11.4 Padding and Cold Start</w:t>
+      </w:r>
+    </w:p>
+    <w:p>
+      <w:r>
+        <w:rPr>
+          <w:sz w:val="22"/>
+        </w:rPr>
+        <w:t>When a user has fewer than K = 50 qualifying behaviors before the impression time, we apply left-padding with zeros, so that the most recent behavior always occupies position K-1 (the last index) and any padding zeros occupy the front of the sequence. This convention enables straightforward implementation of right-anchored attention and is consistent with masked-attention conventions in transformer literature.</w:t>
+      </w:r>
+    </w:p>
+    <w:p>
+      <w:r>
+        <w:rPr>
+          <w:sz w:val="22"/>
+        </w:rPr>
+        <w:t>Cold-start users with no behavior history at all yield an all-zero sequence; the embedding lookup for index 0 thus acts as a learned 'no history' representation that the attention layer can attend to without special-case logic.</w:t>
+      </w:r>
+    </w:p>
+    <w:p>
+      <w:r>
+        <w:rPr>
+          <w:sz w:val="22"/>
+        </w:rPr>
+        <w:t>The resulting distribution on Version A's training partition is:</w:t>
+      </w:r>
+    </w:p>
+    <w:tbl>
+      <w:tblPr>
+        <w:tblStyle w:val="LightGrid-Accent1"/>
+        <w:tblW w:type="auto" w:w="0"/>
+        <w:tblLook w:firstColumn="1" w:firstRow="1" w:lastColumn="0" w:lastRow="0" w:noHBand="0" w:noVBand="1" w:val="04A0"/>
+      </w:tblPr>
+      <w:tblGrid>
+        <w:gridCol w:w="2880"/>
+        <w:gridCol w:w="2880"/>
+        <w:gridCol w:w="2880"/>
+      </w:tblGrid>
+      <w:tr>
+        <w:tc>
+          <w:tcPr>
+            <w:tcW w:type="dxa" w:w="2880"/>
+          </w:tcPr>
+          <w:p>
+            <w:r/>
+            <w:r>
+              <w:rPr>
+                <w:b/>
+                <w:sz w:val="20"/>
+              </w:rPr>
+              <w:t>Sequence Type</w:t>
+            </w:r>
+          </w:p>
+        </w:tc>
+        <w:tc>
+          <w:tcPr>
+            <w:tcW w:type="dxa" w:w="2880"/>
+          </w:tcPr>
+          <w:p>
+            <w:r/>
+            <w:r>
+              <w:rPr>
+                <w:b/>
+                <w:sz w:val="20"/>
+              </w:rPr>
+              <w:t>Count</w:t>
+            </w:r>
+          </w:p>
+        </w:tc>
+        <w:tc>
+          <w:tcPr>
+            <w:tcW w:type="dxa" w:w="2880"/>
+          </w:tcPr>
+          <w:p>
+            <w:r/>
+            <w:r>
+              <w:rPr>
+                <w:b/>
+                <w:sz w:val="20"/>
+              </w:rPr>
+              <w:t>Proportion</w:t>
+            </w:r>
+          </w:p>
+        </w:tc>
+      </w:tr>
+      <w:tr>
+        <w:tc>
+          <w:tcPr>
+            <w:tcW w:type="dxa" w:w="2880"/>
+          </w:tcPr>
+          <w:p>
+            <w:r/>
+            <w:r>
+              <w:rPr>
+                <w:sz w:val="20"/>
+              </w:rPr>
+              <w:t>Full 50-length history</w:t>
+            </w:r>
+          </w:p>
+        </w:tc>
+        <w:tc>
+          <w:tcPr>
+            <w:tcW w:type="dxa" w:w="2880"/>
+          </w:tcPr>
+          <w:p>
+            <w:r/>
+            <w:r>
+              <w:rPr>
+                <w:sz w:val="20"/>
+              </w:rPr>
+              <w:t>17,441,279</w:t>
+            </w:r>
+          </w:p>
+        </w:tc>
+        <w:tc>
+          <w:tcPr>
+            <w:tcW w:type="dxa" w:w="2880"/>
+          </w:tcPr>
+          <w:p>
+            <w:r/>
+            <w:r>
+              <w:rPr>
+                <w:sz w:val="20"/>
+              </w:rPr>
+              <w:t>85.3%</w:t>
+            </w:r>
+          </w:p>
+        </w:tc>
+      </w:tr>
+      <w:tr>
+        <w:tc>
+          <w:tcPr>
+            <w:tcW w:type="dxa" w:w="2880"/>
+          </w:tcPr>
+          <w:p>
+            <w:r/>
+            <w:r>
+              <w:rPr>
+                <w:sz w:val="20"/>
+              </w:rPr>
+              <w:t>Partial history (1 &lt;= length &lt; 50)</w:t>
+            </w:r>
+          </w:p>
+        </w:tc>
+        <w:tc>
+          <w:tcPr>
+            <w:tcW w:type="dxa" w:w="2880"/>
+          </w:tcPr>
+          <w:p>
+            <w:r/>
+            <w:r>
+              <w:rPr>
+                <w:sz w:val="20"/>
+              </w:rPr>
+              <w:t>2,565,937</w:t>
+            </w:r>
+          </w:p>
+        </w:tc>
+        <w:tc>
+          <w:tcPr>
+            <w:tcW w:type="dxa" w:w="2880"/>
+          </w:tcPr>
+          <w:p>
+            <w:r/>
+            <w:r>
+              <w:rPr>
+                <w:sz w:val="20"/>
+              </w:rPr>
+              <w:t>12.6%</w:t>
+            </w:r>
+          </w:p>
+        </w:tc>
+      </w:tr>
+      <w:tr>
+        <w:tc>
+          <w:tcPr>
+            <w:tcW w:type="dxa" w:w="2880"/>
+          </w:tcPr>
+          <w:p>
+            <w:r/>
+            <w:r>
+              <w:rPr>
+                <w:sz w:val="20"/>
+              </w:rPr>
+              <w:t>All-zero (cold start)</w:t>
+            </w:r>
+          </w:p>
+        </w:tc>
+        <w:tc>
+          <w:tcPr>
+            <w:tcW w:type="dxa" w:w="2880"/>
+          </w:tcPr>
+          <w:p>
+            <w:r/>
+            <w:r>
+              <w:rPr>
+                <w:sz w:val="20"/>
+              </w:rPr>
+              <w:t>429,917</w:t>
+            </w:r>
+          </w:p>
+        </w:tc>
+        <w:tc>
+          <w:tcPr>
+            <w:tcW w:type="dxa" w:w="2880"/>
+          </w:tcPr>
+          <w:p>
+            <w:r/>
+            <w:r>
+              <w:rPr>
+                <w:sz w:val="20"/>
+              </w:rPr>
+              <w:t>2.1%</w:t>
+            </w:r>
+          </w:p>
+        </w:tc>
+      </w:tr>
+    </w:tbl>
+    <w:p>
+      <w:r>
+        <w:rPr>
+          <w:sz w:val="22"/>
+        </w:rPr>
+        <w:t>The 85.3% full-history rate indicates that a majority of impressions involve users with substantial behavioral context, which is the regime in which DIN's attention mechanism is most effective. The 2.1% cold-start rate establishes a soft lower bound on the difficulty of cold-start prediction: these impressions cannot benefit from DIN's sequence modeling and serve as a useful test bed for evaluating cold-start robustness.</w:t>
+      </w:r>
+    </w:p>
+    <w:p>
+      <w:pPr>
+        <w:pStyle w:val="Heading3"/>
+      </w:pPr>
+      <w:r>
+        <w:t>4.11.5 Implementation</w:t>
+      </w:r>
+    </w:p>
+    <w:p>
+      <w:r>
+        <w:rPr>
+          <w:sz w:val="22"/>
+        </w:rPr>
+        <w:t>A naive implementation -- iterating over each of 26.5M impressions and scanning the user's behaviors -- would dominate runtime due to Python overhead. We adopt a per-user vectorized strategy:</w:t>
+      </w:r>
+    </w:p>
+    <w:p>
+      <w:pPr>
+        <w:pStyle w:val="ListBullet"/>
+      </w:pPr>
+      <w:r>
+        <w:rPr>
+          <w:sz w:val="22"/>
+        </w:rPr>
+        <w:t>Sort behavior_log by (user, time_stamp) and convert to numpy arrays, yielding contiguous per-user slices.</w:t>
+      </w:r>
+    </w:p>
+    <w:p>
+      <w:pPr>
+        <w:pStyle w:val="ListBullet"/>
+      </w:pPr>
+      <w:r>
+        <w:rPr>
+          <w:sz w:val="22"/>
+        </w:rPr>
+        <w:t>Build a hash map of user -&gt; (index_start, index_end) into the sorted arrays for O(1) per-user lookup.</w:t>
+      </w:r>
+    </w:p>
+    <w:p>
+      <w:pPr>
+        <w:pStyle w:val="ListBullet"/>
+      </w:pPr>
+      <w:r>
+        <w:rPr>
+          <w:sz w:val="22"/>
+        </w:rPr>
+        <w:t>Group impressions by user; for each user, perform a single batched np.searchsorted to locate every impression's cutoff index simultaneously, then use fancy indexing to gather the K preceding behaviors in one vectorized operation.</w:t>
+      </w:r>
+    </w:p>
+    <w:p>
+      <w:r>
+        <w:rPr>
+          <w:sz w:val="22"/>
+        </w:rPr>
+        <w:t>This reduces overall complexity to O(N log N + M) where N is the total number of behaviors and M the number of impressions. End-to-end sequence construction across all six dataset splits completed in under thirty seconds on a 16-core M4 Max system, despite the underlying behavior_log spanning 629M filtered rows.</w:t>
       </w:r>
     </w:p>
     <w:p>
@@ -2901,7 +3283,7 @@
               <w:rPr>
                 <w:sz w:val="20"/>
               </w:rPr>
-              <w:t>34</w:t>
+              <w:t>35</w:t>
             </w:r>
           </w:p>
         </w:tc>
@@ -2915,7 +3297,7 @@
               <w:rPr>
                 <w:sz w:val="20"/>
               </w:rPr>
-              <w:t>788.8 MB</w:t>
+              <w:t>1,832.6 MB</w:t>
             </w:r>
           </w:p>
         </w:tc>
@@ -2959,7 +3341,7 @@
               <w:rPr>
                 <w:sz w:val="20"/>
               </w:rPr>
-              <w:t>34</w:t>
+              <w:t>35</w:t>
             </w:r>
           </w:p>
         </w:tc>
@@ -2973,7 +3355,7 @@
               <w:rPr>
                 <w:sz w:val="20"/>
               </w:rPr>
-              <w:t>134.5 MB</w:t>
+              <w:t>307.8 MB</w:t>
             </w:r>
           </w:p>
         </w:tc>
@@ -3017,7 +3399,7 @@
               <w:rPr>
                 <w:sz w:val="20"/>
               </w:rPr>
-              <w:t>34</w:t>
+              <w:t>35</w:t>
             </w:r>
           </w:p>
         </w:tc>
@@ -3031,7 +3413,7 @@
               <w:rPr>
                 <w:sz w:val="20"/>
               </w:rPr>
-              <w:t>114.8 MB</w:t>
+              <w:t>265.2 MB</w:t>
             </w:r>
           </w:p>
         </w:tc>
@@ -3075,7 +3457,7 @@
               <w:rPr>
                 <w:sz w:val="20"/>
               </w:rPr>
-              <w:t>33</w:t>
+              <w:t>34</w:t>
             </w:r>
           </w:p>
         </w:tc>
@@ -3089,7 +3471,7 @@
               <w:rPr>
                 <w:sz w:val="20"/>
               </w:rPr>
-              <w:t>742.2 MB</w:t>
+              <w:t>1,726.6 MB</w:t>
             </w:r>
           </w:p>
         </w:tc>
@@ -3133,7 +3515,7 @@
               <w:rPr>
                 <w:sz w:val="20"/>
               </w:rPr>
-              <w:t>33</w:t>
+              <w:t>34</w:t>
             </w:r>
           </w:p>
         </w:tc>
@@ -3147,7 +3529,7 @@
               <w:rPr>
                 <w:sz w:val="20"/>
               </w:rPr>
-              <w:t>126.4 MB</w:t>
+              <w:t>289.6 MB</w:t>
             </w:r>
           </w:p>
         </w:tc>
@@ -3191,7 +3573,7 @@
               <w:rPr>
                 <w:sz w:val="20"/>
               </w:rPr>
-              <w:t>33</w:t>
+              <w:t>34</w:t>
             </w:r>
           </w:p>
         </w:tc>
@@ -3205,7 +3587,7 @@
               <w:rPr>
                 <w:sz w:val="20"/>
               </w:rPr>
-              <w:t>107.5 MB</w:t>
+              <w:t>248.4 MB</w:t>
             </w:r>
           </w:p>
         </w:tc>
@@ -3263,7 +3645,7 @@
               <w:rPr>
                 <w:sz w:val="20"/>
               </w:rPr>
-              <w:t>2.02 GB</w:t>
+              <w:t>4.56 GB</w:t>
             </w:r>
           </w:p>
         </w:tc>
@@ -3274,7 +3656,7 @@
         <w:rPr>
           <w:sz w:val="22"/>
         </w:rPr>
-        <w:t>Each row constitutes a self-contained training example: a click label clk in {0, 1} accompanied by 33 (Version B) or 34 (Version A) feature columns spanning user demographics, ad metadata, temporal context, impression-level aggregates, behavior-log aggregates, and a user-by-category cross-aggregate.</w:t>
+        <w:t>Each row constitutes a self-contained training example: a click label clk in {0, 1} accompanied by 34 (Version B) or 35 (Version A) feature columns spanning user demographics, ad metadata, temporal context, impression-level aggregates, behavior-log aggregates, a user-by-category cross-aggregate, and a length-50 user behavior sequence. Static-feature baselines (LR, LightGBM, Wide &amp; Deep, DeepFM) consume the 33 / 34 scalar feature columns; DIN consumes the same scalar features and additionally attends over the behavior_seq column.</w:t>
       </w:r>
     </w:p>
     <w:sectPr>

</xml_diff>